<commit_message>
chore: regenerate resume formats
</commit_message>
<xml_diff>
--- a/resume/en/resume.docx
+++ b/resume/en/resume.docx
@@ -2,7 +2,7 @@
 <file path=word/document.xml><?xml version="1.0" encoding="utf-8"?>
 <w:document xmlns:w="http://schemas.openxmlformats.org/wordprocessingml/2006/main" xmlns:m="http://schemas.openxmlformats.org/officeDocument/2006/math" xmlns:r="http://schemas.openxmlformats.org/officeDocument/2006/relationships" xmlns:o="urn:schemas-microsoft-com:office:office" xmlns:v="urn:schemas-microsoft-com:vml" xmlns:w10="urn:schemas-microsoft-com:office:word" xmlns:a="http://schemas.openxmlformats.org/drawingml/2006/main" xmlns:pic="http://schemas.openxmlformats.org/drawingml/2006/picture" xmlns:wp="http://schemas.openxmlformats.org/drawingml/2006/wordprocessingDrawing">
   <w:body>
-    <w:bookmarkStart w:id="30" w:name="matvey-sizov"/>
+    <w:bookmarkStart w:id="41" w:name="matvey-sizov"/>
     <w:p>
       <w:pPr>
         <w:pStyle w:val="Heading1"/>
@@ -27,7 +27,7 @@
       <w:r>
         <w:t xml:space="preserve"> </w:t>
       </w:r>
-      <w:hyperlink r:id="rId9">
+      <w:hyperlink r:id="rId20">
         <w:r>
           <w:rPr>
             <w:rStyle w:val="Hyperlink"/>
@@ -44,7 +44,7 @@
       <w:r>
         <w:t xml:space="preserve"> </w:t>
       </w:r>
-      <w:hyperlink r:id="rId10">
+      <w:hyperlink r:id="rId21">
         <w:r>
           <w:rPr>
             <w:rStyle w:val="Hyperlink"/>
@@ -61,7 +61,7 @@
       <w:r>
         <w:t xml:space="preserve"> </w:t>
       </w:r>
-      <w:hyperlink r:id="rId11">
+      <w:hyperlink r:id="rId22">
         <w:r>
           <w:rPr>
             <w:rStyle w:val="Hyperlink"/>
@@ -78,7 +78,7 @@
       <w:r>
         <w:t xml:space="preserve"> </w:t>
       </w:r>
-      <w:hyperlink r:id="rId12">
+      <w:hyperlink r:id="rId23">
         <w:r>
           <w:rPr>
             <w:rStyle w:val="Hyperlink"/>
@@ -95,7 +95,7 @@
         <w:t xml:space="preserve">4+ years building high-load backend and distributed systems in Go | from EV vehicle-to-cloud communication to service-mesh platform infrastructure.</w:t>
       </w:r>
     </w:p>
-    <w:bookmarkStart w:id="21" w:name="experience"/>
+    <w:bookmarkStart w:id="32" w:name="experience"/>
     <w:p>
       <w:pPr>
         <w:pStyle w:val="Heading2"/>
@@ -104,7 +104,7 @@
         <w:t xml:space="preserve">EXPERIENCE</w:t>
       </w:r>
     </w:p>
-    <w:bookmarkStart w:id="14" w:name="Xdf4dc2a895e930374a7b7d897161217cead78be"/>
+    <w:bookmarkStart w:id="25" w:name="Xdf4dc2a895e930374a7b7d897161217cead78be"/>
     <w:p>
       <w:pPr>
         <w:pStyle w:val="Heading3"/>
@@ -117,7 +117,7 @@
       <w:pPr>
         <w:pStyle w:val="FirstParagraph"/>
       </w:pPr>
-      <w:hyperlink r:id="rId13">
+      <w:hyperlink r:id="rId24">
         <w:r>
           <w:rPr>
             <w:rStyle w:val="Hyperlink"/>
@@ -134,11 +134,11 @@
     </w:p>
     <w:p>
       <w:pPr>
-        <w:pStyle w:val="Compact"/>
         <w:numPr>
           <w:ilvl w:val="0"/>
           <w:numId w:val="1001"/>
         </w:numPr>
+        <w:pStyle w:val="Compact"/>
       </w:pPr>
       <w:r>
         <w:t xml:space="preserve">Designed and co-developed an mTLS-secured MQTT broker for persistent car-to-cloud connectivity.</w:t>
@@ -146,11 +146,11 @@
     </w:p>
     <w:p>
       <w:pPr>
-        <w:pStyle w:val="Compact"/>
         <w:numPr>
           <w:ilvl w:val="0"/>
           <w:numId w:val="1001"/>
         </w:numPr>
+        <w:pStyle w:val="Compact"/>
       </w:pPr>
       <w:r>
         <w:t xml:space="preserve">Reframed ambiguous requirements with engineering and product leadership, converting a risky initiative into a releasable architecture.</w:t>
@@ -158,11 +158,11 @@
     </w:p>
     <w:p>
       <w:pPr>
-        <w:pStyle w:val="Compact"/>
         <w:numPr>
           <w:ilvl w:val="0"/>
           <w:numId w:val="1001"/>
         </w:numPr>
+        <w:pStyle w:val="Compact"/>
       </w:pPr>
       <w:r>
         <w:t xml:space="preserve">Delivered high-load performance around 70K req/s with p99 latency below 50 ms.</w:t>
@@ -170,11 +170,11 @@
     </w:p>
     <w:p>
       <w:pPr>
-        <w:pStyle w:val="Compact"/>
         <w:numPr>
           <w:ilvl w:val="0"/>
           <w:numId w:val="1001"/>
         </w:numPr>
+        <w:pStyle w:val="Compact"/>
       </w:pPr>
       <w:r>
         <w:t xml:space="preserve">Built observability from scratch (metrics, logs, traces, dashboards, alerts) after DevOps ownership gap.</w:t>
@@ -182,11 +182,11 @@
     </w:p>
     <w:p>
       <w:pPr>
-        <w:pStyle w:val="Compact"/>
         <w:numPr>
           <w:ilvl w:val="0"/>
           <w:numId w:val="1001"/>
         </w:numPr>
+        <w:pStyle w:val="Compact"/>
       </w:pPr>
       <w:r>
         <w:t xml:space="preserve">Owned CI/CD and deployment setup to keep delivery stable in production.</w:t>
@@ -200,8 +200,8 @@
         <w:t xml:space="preserve">Stack: Go, MQTT, Redis, PostgreSQL, gRPC, mTLS, Prometheus, Grafana, Loki, Sentry, Docker, Kubernetes, CI/CD</w:t>
       </w:r>
     </w:p>
-    <w:bookmarkEnd w:id="14"/>
-    <w:bookmarkStart w:id="16" w:name="Xcf0de643b142f6d73b8d42fea4d79589f0a4016"/>
+    <w:bookmarkEnd w:id="25"/>
+    <w:bookmarkStart w:id="27" w:name="Xcf0de643b142f6d73b8d42fea4d79589f0a4016"/>
     <w:p>
       <w:pPr>
         <w:pStyle w:val="Heading3"/>
@@ -214,7 +214,7 @@
       <w:pPr>
         <w:pStyle w:val="FirstParagraph"/>
       </w:pPr>
-      <w:hyperlink r:id="rId15">
+      <w:hyperlink r:id="rId26">
         <w:r>
           <w:rPr>
             <w:rStyle w:val="Hyperlink"/>
@@ -231,11 +231,11 @@
     </w:p>
     <w:p>
       <w:pPr>
-        <w:pStyle w:val="Compact"/>
         <w:numPr>
           <w:ilvl w:val="0"/>
           <w:numId w:val="1002"/>
         </w:numPr>
+        <w:pStyle w:val="Compact"/>
       </w:pPr>
       <w:r>
         <w:t xml:space="preserve">Restored broken test pipeline and increased unit-test coverage to 80%.</w:t>
@@ -243,11 +243,11 @@
     </w:p>
     <w:p>
       <w:pPr>
-        <w:pStyle w:val="Compact"/>
         <w:numPr>
           <w:ilvl w:val="0"/>
           <w:numId w:val="1002"/>
         </w:numPr>
+        <w:pStyle w:val="Compact"/>
       </w:pPr>
       <w:r>
         <w:t xml:space="preserve">Designed and implemented a Go integration-testing framework for isolated Kubernetes environments.</w:t>
@@ -255,11 +255,11 @@
     </w:p>
     <w:p>
       <w:pPr>
-        <w:pStyle w:val="Compact"/>
         <w:numPr>
           <w:ilvl w:val="0"/>
           <w:numId w:val="1002"/>
         </w:numPr>
+        <w:pStyle w:val="Compact"/>
       </w:pPr>
       <w:r>
         <w:t xml:space="preserve">Repaired CI reliability and shifted defect detection to earlier development stages.</w:t>
@@ -267,11 +267,11 @@
     </w:p>
     <w:p>
       <w:pPr>
-        <w:pStyle w:val="Compact"/>
         <w:numPr>
           <w:ilvl w:val="0"/>
           <w:numId w:val="1002"/>
         </w:numPr>
+        <w:pStyle w:val="Compact"/>
       </w:pPr>
       <w:r>
         <w:t xml:space="preserve">Mentored interns and scaled automation output by standardizing framework-based test delivery.</w:t>
@@ -279,11 +279,11 @@
     </w:p>
     <w:p>
       <w:pPr>
-        <w:pStyle w:val="Compact"/>
         <w:numPr>
           <w:ilvl w:val="0"/>
           <w:numId w:val="1002"/>
         </w:numPr>
+        <w:pStyle w:val="Compact"/>
       </w:pPr>
       <w:r>
         <w:t xml:space="preserve">Implemented custom Kubernetes resource logic for control-plane/data-plane relationship management in Istio.</w:t>
@@ -297,8 +297,8 @@
         <w:t xml:space="preserve">Stack: Go, Kubernetes, Istio, gRPC, REST, PostgreSQL, Allure, CI/CD</w:t>
       </w:r>
     </w:p>
-    <w:bookmarkEnd w:id="16"/>
-    <w:bookmarkStart w:id="17" w:name="Xa4f10535f1676c1fc23666d8976ed1c24736c2b"/>
+    <w:bookmarkEnd w:id="27"/>
+    <w:bookmarkStart w:id="28" w:name="Xa4f10535f1676c1fc23666d8976ed1c24736c2b"/>
     <w:p>
       <w:pPr>
         <w:pStyle w:val="Heading3"/>
@@ -317,11 +317,11 @@
     </w:p>
     <w:p>
       <w:pPr>
-        <w:pStyle w:val="Compact"/>
         <w:numPr>
           <w:ilvl w:val="0"/>
           <w:numId w:val="1003"/>
         </w:numPr>
+        <w:pStyle w:val="Compact"/>
       </w:pPr>
       <w:r>
         <w:t xml:space="preserve">Implemented backend data collection and normalization for in-store pricing evidence.</w:t>
@@ -329,11 +329,11 @@
     </w:p>
     <w:p>
       <w:pPr>
-        <w:pStyle w:val="Compact"/>
         <w:numPr>
           <w:ilvl w:val="0"/>
           <w:numId w:val="1003"/>
         </w:numPr>
+        <w:pStyle w:val="Compact"/>
       </w:pPr>
       <w:r>
         <w:t xml:space="preserve">Integrated employee input, product metadata, and ML outputs into one operational pipeline.</w:t>
@@ -341,11 +341,11 @@
     </w:p>
     <w:p>
       <w:pPr>
-        <w:pStyle w:val="Compact"/>
         <w:numPr>
           <w:ilvl w:val="0"/>
           <w:numId w:val="1003"/>
         </w:numPr>
+        <w:pStyle w:val="Compact"/>
       </w:pPr>
       <w:r>
         <w:t xml:space="preserve">Delivered production features from development phase to release.</w:t>
@@ -359,8 +359,8 @@
         <w:t xml:space="preserve">Stack: Go, PostgreSQL, Redis, Kafka, MinIO, gRPC, Prometheus, CI/CD</w:t>
       </w:r>
     </w:p>
-    <w:bookmarkEnd w:id="17"/>
-    <w:bookmarkStart w:id="19" w:name="Xc1dc0406c56050bd2dc63c3d334563d62d377ae"/>
+    <w:bookmarkEnd w:id="28"/>
+    <w:bookmarkStart w:id="30" w:name="Xc1dc0406c56050bd2dc63c3d334563d62d377ae"/>
     <w:p>
       <w:pPr>
         <w:pStyle w:val="Heading3"/>
@@ -373,7 +373,7 @@
       <w:pPr>
         <w:pStyle w:val="FirstParagraph"/>
       </w:pPr>
-      <w:hyperlink r:id="rId18">
+      <w:hyperlink r:id="rId29">
         <w:r>
           <w:rPr>
             <w:rStyle w:val="Hyperlink"/>
@@ -390,11 +390,11 @@
     </w:p>
     <w:p>
       <w:pPr>
-        <w:pStyle w:val="Compact"/>
         <w:numPr>
           <w:ilvl w:val="0"/>
           <w:numId w:val="1004"/>
         </w:numPr>
+        <w:pStyle w:val="Compact"/>
       </w:pPr>
       <w:r>
         <w:t xml:space="preserve">Implemented core P2P exchange flows and exchange-rate management logic.</w:t>
@@ -402,11 +402,11 @@
     </w:p>
     <w:p>
       <w:pPr>
-        <w:pStyle w:val="Compact"/>
         <w:numPr>
           <w:ilvl w:val="0"/>
           <w:numId w:val="1004"/>
         </w:numPr>
+        <w:pStyle w:val="Compact"/>
       </w:pPr>
       <w:r>
         <w:t xml:space="preserve">Delivered end-to-end exchange functionality in a lean engineering team.</w:t>
@@ -414,11 +414,11 @@
     </w:p>
     <w:p>
       <w:pPr>
-        <w:pStyle w:val="Compact"/>
         <w:numPr>
           <w:ilvl w:val="0"/>
           <w:numId w:val="1004"/>
         </w:numPr>
+        <w:pStyle w:val="Compact"/>
       </w:pPr>
       <w:r>
         <w:t xml:space="preserve">After an early-career pricing incident, introduced stricter validation and safer rollout discipline.</w:t>
@@ -432,8 +432,8 @@
         <w:t xml:space="preserve">Stack: Go, PostgreSQL, Redis, RabbitMQ, gRPC, REST</w:t>
       </w:r>
     </w:p>
-    <w:bookmarkEnd w:id="19"/>
-    <w:bookmarkStart w:id="20" w:name="X366a8192faf465afa5f5ad528be760c70f1133a"/>
+    <w:bookmarkEnd w:id="30"/>
+    <w:bookmarkStart w:id="31" w:name="X366a8192faf465afa5f5ad528be760c70f1133a"/>
     <w:p>
       <w:pPr>
         <w:pStyle w:val="Heading3"/>
@@ -444,11 +444,11 @@
     </w:p>
     <w:p>
       <w:pPr>
-        <w:pStyle w:val="Compact"/>
         <w:numPr>
           <w:ilvl w:val="0"/>
           <w:numId w:val="1005"/>
         </w:numPr>
+        <w:pStyle w:val="Compact"/>
       </w:pPr>
       <w:r>
         <w:t xml:space="preserve">Conduct mock interviews and backend mentoring sessions.</w:t>
@@ -456,19 +456,19 @@
     </w:p>
     <w:p>
       <w:pPr>
-        <w:pStyle w:val="Compact"/>
         <w:numPr>
           <w:ilvl w:val="0"/>
           <w:numId w:val="1005"/>
         </w:numPr>
+        <w:pStyle w:val="Compact"/>
       </w:pPr>
       <w:r>
         <w:t xml:space="preserve">Coach candidates on technical communication, concise answer structure, and tradeoff reasoning.</w:t>
       </w:r>
     </w:p>
-    <w:bookmarkEnd w:id="20"/>
-    <w:bookmarkEnd w:id="21"/>
-    <w:bookmarkStart w:id="24" w:name="earlier-experience"/>
+    <w:bookmarkEnd w:id="31"/>
+    <w:bookmarkEnd w:id="32"/>
+    <w:bookmarkStart w:id="35" w:name="earlier-experience"/>
     <w:p>
       <w:pPr>
         <w:pStyle w:val="Heading2"/>
@@ -477,7 +477,7 @@
         <w:t xml:space="preserve">EARLIER EXPERIENCE</w:t>
       </w:r>
     </w:p>
-    <w:bookmarkStart w:id="22" w:name="X278c340b647914550daa9dffb46aa4826e14d2c"/>
+    <w:bookmarkStart w:id="33" w:name="X278c340b647914550daa9dffb46aa4826e14d2c"/>
     <w:p>
       <w:pPr>
         <w:pStyle w:val="Heading3"/>
@@ -488,18 +488,18 @@
     </w:p>
     <w:p>
       <w:pPr>
-        <w:pStyle w:val="Compact"/>
         <w:numPr>
           <w:ilvl w:val="0"/>
           <w:numId w:val="1006"/>
         </w:numPr>
+        <w:pStyle w:val="Compact"/>
       </w:pPr>
       <w:r>
         <w:t xml:space="preserve">Built backend for utility customer account and admin workflows.</w:t>
       </w:r>
     </w:p>
-    <w:bookmarkEnd w:id="22"/>
-    <w:bookmarkStart w:id="23" w:name="Xdbd939e930bb1857388ce97e6eee799d43ed5e5"/>
+    <w:bookmarkEnd w:id="33"/>
+    <w:bookmarkStart w:id="34" w:name="Xdbd939e930bb1857388ce97e6eee799d43ed5e5"/>
     <w:p>
       <w:pPr>
         <w:pStyle w:val="Heading3"/>
@@ -510,19 +510,19 @@
     </w:p>
     <w:p>
       <w:pPr>
-        <w:pStyle w:val="Compact"/>
         <w:numPr>
           <w:ilvl w:val="0"/>
           <w:numId w:val="1007"/>
         </w:numPr>
+        <w:pStyle w:val="Compact"/>
       </w:pPr>
       <w:r>
         <w:t xml:space="preserve">Contributed to public-sector digital and operational tracking services.</w:t>
       </w:r>
     </w:p>
-    <w:bookmarkEnd w:id="23"/>
-    <w:bookmarkEnd w:id="24"/>
-    <w:bookmarkStart w:id="25" w:name="skills"/>
+    <w:bookmarkEnd w:id="34"/>
+    <w:bookmarkEnd w:id="35"/>
+    <w:bookmarkStart w:id="36" w:name="skills"/>
     <w:p>
       <w:pPr>
         <w:pStyle w:val="Heading2"/>
@@ -533,11 +533,11 @@
     </w:p>
     <w:p>
       <w:pPr>
-        <w:pStyle w:val="Compact"/>
         <w:numPr>
           <w:ilvl w:val="0"/>
           <w:numId w:val="1008"/>
         </w:numPr>
+        <w:pStyle w:val="Compact"/>
       </w:pPr>
       <w:r>
         <w:t xml:space="preserve">Languages: Go, Java, Python, SQL</w:t>
@@ -545,11 +545,11 @@
     </w:p>
     <w:p>
       <w:pPr>
-        <w:pStyle w:val="Compact"/>
         <w:numPr>
           <w:ilvl w:val="0"/>
           <w:numId w:val="1008"/>
         </w:numPr>
+        <w:pStyle w:val="Compact"/>
       </w:pPr>
       <w:r>
         <w:t xml:space="preserve">Data and Messaging: PostgreSQL, Redis, Kafka, RabbitMQ, NATS, MQTT</w:t>
@@ -557,11 +557,11 @@
     </w:p>
     <w:p>
       <w:pPr>
-        <w:pStyle w:val="Compact"/>
         <w:numPr>
           <w:ilvl w:val="0"/>
           <w:numId w:val="1008"/>
         </w:numPr>
+        <w:pStyle w:val="Compact"/>
       </w:pPr>
       <w:r>
         <w:t xml:space="preserve">Platform: Docker, Kubernetes, Helm, Istio, Linux, Git, CI/CD</w:t>
@@ -569,11 +569,11 @@
     </w:p>
     <w:p>
       <w:pPr>
-        <w:pStyle w:val="Compact"/>
         <w:numPr>
           <w:ilvl w:val="0"/>
           <w:numId w:val="1008"/>
         </w:numPr>
+        <w:pStyle w:val="Compact"/>
       </w:pPr>
       <w:r>
         <w:t xml:space="preserve">Observability: Prometheus, Grafana, Loki, Sentry, tracing, alerting</w:t>
@@ -581,18 +581,18 @@
     </w:p>
     <w:p>
       <w:pPr>
-        <w:pStyle w:val="Compact"/>
         <w:numPr>
           <w:ilvl w:val="0"/>
           <w:numId w:val="1008"/>
         </w:numPr>
+        <w:pStyle w:val="Compact"/>
       </w:pPr>
       <w:r>
         <w:t xml:space="preserve">Focus Areas: distributed systems, high-load backend, service reliability, testing infrastructure, mentoring</w:t>
       </w:r>
     </w:p>
-    <w:bookmarkEnd w:id="25"/>
-    <w:bookmarkStart w:id="28" w:name="education"/>
+    <w:bookmarkEnd w:id="36"/>
+    <w:bookmarkStart w:id="39" w:name="education"/>
     <w:p>
       <w:pPr>
         <w:pStyle w:val="Heading2"/>
@@ -601,7 +601,7 @@
         <w:t xml:space="preserve">EDUCATION</w:t>
       </w:r>
     </w:p>
-    <w:bookmarkStart w:id="26" w:name="voronezh-state-technical-university"/>
+    <w:bookmarkStart w:id="37" w:name="voronezh-state-technical-university"/>
     <w:p>
       <w:pPr>
         <w:pStyle w:val="Heading3"/>
@@ -618,8 +618,8 @@
         <w:t xml:space="preserve">B.S. in Intelligent Automated Systems (part-time) | Expected 2030</w:t>
       </w:r>
     </w:p>
-    <w:bookmarkEnd w:id="26"/>
-    <w:bookmarkStart w:id="27" w:name="voronezh-state-technical-university-1"/>
+    <w:bookmarkEnd w:id="37"/>
+    <w:bookmarkStart w:id="38" w:name="voronezh-state-technical-university-1"/>
     <w:p>
       <w:pPr>
         <w:pStyle w:val="Heading3"/>
@@ -636,9 +636,9 @@
         <w:t xml:space="preserve">Secondary Vocational Diploma in Information Technology and Programming (with honors) | 2021 - 2025</w:t>
       </w:r>
     </w:p>
-    <w:bookmarkEnd w:id="27"/>
-    <w:bookmarkEnd w:id="28"/>
-    <w:bookmarkStart w:id="29" w:name="languages"/>
+    <w:bookmarkEnd w:id="38"/>
+    <w:bookmarkEnd w:id="39"/>
+    <w:bookmarkStart w:id="40" w:name="languages"/>
     <w:p>
       <w:pPr>
         <w:pStyle w:val="Heading2"/>
@@ -649,11 +649,11 @@
     </w:p>
     <w:p>
       <w:pPr>
-        <w:pStyle w:val="Compact"/>
         <w:numPr>
           <w:ilvl w:val="0"/>
           <w:numId w:val="1009"/>
         </w:numPr>
+        <w:pStyle w:val="Compact"/>
       </w:pPr>
       <w:r>
         <w:t xml:space="preserve">Russian: Native</w:t>
@@ -661,23 +661,19 @@
     </w:p>
     <w:p>
       <w:pPr>
-        <w:pStyle w:val="Compact"/>
         <w:numPr>
           <w:ilvl w:val="0"/>
           <w:numId w:val="1009"/>
         </w:numPr>
+        <w:pStyle w:val="Compact"/>
       </w:pPr>
       <w:r>
         <w:t xml:space="preserve">English: B2 (working proficiency; actively improving spoken communication)</w:t>
       </w:r>
     </w:p>
-    <w:bookmarkEnd w:id="29"/>
-    <w:bookmarkEnd w:id="30"/>
-    <w:sectPr>
-      <w:footnotePr>
-        <w:numRestart w:val="eachSect"/>
-      </w:footnotePr>
-    </w:sectPr>
+    <w:bookmarkEnd w:id="40"/>
+    <w:bookmarkEnd w:id="41"/>
+    <w:sectPr/>
   </w:body>
 </w:document>
 </file>
@@ -708,14 +704,14 @@
 <file path=word/numbering.xml><?xml version="1.0" encoding="utf-8"?>
 <w:numbering xmlns:w="http://schemas.openxmlformats.org/wordprocessingml/2006/main">
   <w:abstractNum w:abstractNumId="990">
-    <w:nsid w:val="0000A990"/>
+    <w:nsid w:val="A990"/>
     <w:multiLevelType w:val="multilevel"/>
     <w:lvl w:ilvl="0">
       <w:numFmt w:val="bullet"/>
       <w:lvlText w:val=" "/>
       <w:lvlJc w:val="left"/>
       <w:pPr>
-        <w:ind w:left="720" w:hanging="360"/>
+        <w:ind w:left="720" w:hanging="480"/>
       </w:pPr>
     </w:lvl>
     <w:lvl w:ilvl="1">
@@ -723,7 +719,7 @@
       <w:lvlText w:val=" "/>
       <w:lvlJc w:val="left"/>
       <w:pPr>
-        <w:ind w:left="1440" w:hanging="360"/>
+        <w:ind w:left="1440" w:hanging="480"/>
       </w:pPr>
     </w:lvl>
     <w:lvl w:ilvl="2">
@@ -731,7 +727,7 @@
       <w:lvlText w:val=" "/>
       <w:lvlJc w:val="left"/>
       <w:pPr>
-        <w:ind w:left="2160" w:hanging="360"/>
+        <w:ind w:left="2160" w:hanging="480"/>
       </w:pPr>
     </w:lvl>
     <w:lvl w:ilvl="3">
@@ -739,7 +735,7 @@
       <w:lvlText w:val=" "/>
       <w:lvlJc w:val="left"/>
       <w:pPr>
-        <w:ind w:left="2880" w:hanging="360"/>
+        <w:ind w:left="2880" w:hanging="480"/>
       </w:pPr>
     </w:lvl>
     <w:lvl w:ilvl="4">
@@ -747,7 +743,7 @@
       <w:lvlText w:val=" "/>
       <w:lvlJc w:val="left"/>
       <w:pPr>
-        <w:ind w:left="3600" w:hanging="360"/>
+        <w:ind w:left="3600" w:hanging="480"/>
       </w:pPr>
     </w:lvl>
     <w:lvl w:ilvl="5">
@@ -755,7 +751,7 @@
       <w:lvlText w:val=" "/>
       <w:lvlJc w:val="left"/>
       <w:pPr>
-        <w:ind w:left="4320" w:hanging="360"/>
+        <w:ind w:left="4320" w:hanging="480"/>
       </w:pPr>
     </w:lvl>
     <w:lvl w:ilvl="6">
@@ -763,7 +759,7 @@
       <w:lvlText w:val=" "/>
       <w:lvlJc w:val="left"/>
       <w:pPr>
-        <w:ind w:left="5040" w:hanging="360"/>
+        <w:ind w:left="5040" w:hanging="480"/>
       </w:pPr>
     </w:lvl>
     <w:lvl w:ilvl="7">
@@ -771,7 +767,7 @@
       <w:lvlText w:val=" "/>
       <w:lvlJc w:val="left"/>
       <w:pPr>
-        <w:ind w:left="5760" w:hanging="360"/>
+        <w:ind w:left="5760" w:hanging="480"/>
       </w:pPr>
     </w:lvl>
     <w:lvl w:ilvl="8">
@@ -779,111 +775,84 @@
       <w:lvlText w:val=" "/>
       <w:lvlJc w:val="left"/>
       <w:pPr>
-        <w:ind w:left="6480" w:hanging="360"/>
+        <w:ind w:left="6480" w:hanging="480"/>
       </w:pPr>
     </w:lvl>
   </w:abstractNum>
   <w:abstractNum w:abstractNumId="991">
-    <w:nsid w:val="0000A991"/>
+    <w:nsid w:val="A991"/>
     <w:multiLevelType w:val="multilevel"/>
     <w:lvl w:ilvl="0">
       <w:numFmt w:val="bullet"/>
-      <w:lvlText w:val=""/>
+      <w:lvlText w:val="•"/>
       <w:lvlJc w:val="left"/>
       <w:pPr>
-        <w:ind w:left="720" w:hanging="360"/>
-      </w:pPr>
-      <w:rPr>
-        <w:rFonts w:ascii="Symbol" w:hAnsi="Symbol" w:cs="Symbol" w:hint="default"/>
-      </w:rPr>
+        <w:ind w:left="720" w:hanging="480"/>
+      </w:pPr>
     </w:lvl>
     <w:lvl w:ilvl="1">
       <w:numFmt w:val="bullet"/>
-      <w:lvlText w:val="o"/>
+      <w:lvlText w:val="–"/>
       <w:lvlJc w:val="left"/>
       <w:pPr>
-        <w:ind w:left="1440" w:hanging="360"/>
-      </w:pPr>
-      <w:rPr>
-        <w:rFonts w:ascii="Courier New" w:hAnsi="Courier New" w:cs="Courier New" w:hint="default"/>
-      </w:rPr>
+        <w:ind w:left="1440" w:hanging="480"/>
+      </w:pPr>
     </w:lvl>
     <w:lvl w:ilvl="2">
       <w:numFmt w:val="bullet"/>
-      <w:lvlText w:val=""/>
+      <w:lvlText w:val="•"/>
       <w:lvlJc w:val="left"/>
       <w:pPr>
-        <w:ind w:left="2160" w:hanging="360"/>
-      </w:pPr>
-      <w:rPr>
-        <w:rFonts w:ascii="Wingdings" w:hAnsi="Wingdings" w:cs="Wingdings" w:hint="default"/>
-      </w:rPr>
+        <w:ind w:left="2160" w:hanging="480"/>
+      </w:pPr>
     </w:lvl>
     <w:lvl w:ilvl="3">
       <w:numFmt w:val="bullet"/>
-      <w:lvlText w:val=""/>
+      <w:lvlText w:val="–"/>
       <w:lvlJc w:val="left"/>
       <w:pPr>
-        <w:ind w:left="2880" w:hanging="360"/>
-      </w:pPr>
-      <w:rPr>
-        <w:rFonts w:ascii="Symbol" w:hAnsi="Symbol" w:cs="Symbol" w:hint="default"/>
-      </w:rPr>
+        <w:ind w:left="2880" w:hanging="480"/>
+      </w:pPr>
     </w:lvl>
     <w:lvl w:ilvl="4">
       <w:numFmt w:val="bullet"/>
-      <w:lvlText w:val="o"/>
+      <w:lvlText w:val="•"/>
       <w:lvlJc w:val="left"/>
       <w:pPr>
-        <w:ind w:left="3600" w:hanging="360"/>
-      </w:pPr>
-      <w:rPr>
-        <w:rFonts w:ascii="Courier New" w:hAnsi="Courier New" w:cs="Courier New" w:hint="default"/>
-      </w:rPr>
+        <w:ind w:left="3600" w:hanging="480"/>
+      </w:pPr>
     </w:lvl>
     <w:lvl w:ilvl="5">
       <w:numFmt w:val="bullet"/>
-      <w:lvlText w:val=""/>
+      <w:lvlText w:val="–"/>
       <w:lvlJc w:val="left"/>
       <w:pPr>
-        <w:ind w:left="4320" w:hanging="360"/>
-      </w:pPr>
-      <w:rPr>
-        <w:rFonts w:ascii="Wingdings" w:hAnsi="Wingdings" w:cs="Wingdings" w:hint="default"/>
-      </w:rPr>
+        <w:ind w:left="4320" w:hanging="480"/>
+      </w:pPr>
     </w:lvl>
     <w:lvl w:ilvl="6">
       <w:numFmt w:val="bullet"/>
-      <w:lvlText w:val=""/>
+      <w:lvlText w:val="•"/>
       <w:lvlJc w:val="left"/>
       <w:pPr>
-        <w:ind w:left="5040" w:hanging="360"/>
-      </w:pPr>
-      <w:rPr>
-        <w:rFonts w:ascii="Symbol" w:hAnsi="Symbol" w:cs="Symbol" w:hint="default"/>
-      </w:rPr>
+        <w:ind w:left="5040" w:hanging="480"/>
+      </w:pPr>
     </w:lvl>
     <w:lvl w:ilvl="7">
       <w:numFmt w:val="bullet"/>
-      <w:lvlText w:val="o"/>
+      <w:lvlText w:val="–"/>
       <w:lvlJc w:val="left"/>
       <w:pPr>
-        <w:ind w:left="5760" w:hanging="360"/>
-      </w:pPr>
-      <w:rPr>
-        <w:rFonts w:ascii="Courier New" w:hAnsi="Courier New" w:cs="Courier New" w:hint="default"/>
-      </w:rPr>
+        <w:ind w:left="5760" w:hanging="480"/>
+      </w:pPr>
     </w:lvl>
     <w:lvl w:ilvl="8">
       <w:numFmt w:val="bullet"/>
-      <w:lvlText w:val=""/>
+      <w:lvlText w:val="•"/>
       <w:lvlJc w:val="left"/>
       <w:pPr>
-        <w:ind w:left="6480" w:hanging="360"/>
-      </w:pPr>
-      <w:rPr>
-        <w:rFonts w:ascii="Wingdings" w:hAnsi="Wingdings" w:cs="Wingdings" w:hint="default"/>
-      </w:rPr>
+        <w:ind w:left="6480" w:hanging="480"/>
+      </w:pPr>
     </w:lvl>
   </w:abstractNum>
   <w:num w:numId="1000">
@@ -924,10 +893,10 @@
   <w:docDefaults>
     <w:rPrDefault>
       <w:rPr>
-        <w:rFonts w:asciiTheme="minorHAnsi" w:cstheme="minorBidi" w:eastAsiaTheme="minorEastAsia" w:hAnsiTheme="minorHAnsi"/>
+        <w:rFonts w:asciiTheme="minorHAnsi" w:cstheme="minorBidi" w:eastAsiaTheme="minorHAnsi" w:hAnsiTheme="minorHAnsi"/>
         <w:sz w:val="24"/>
         <w:szCs w:val="24"/>
-        <w:lang w:bidi="ar-SA" w:eastAsia="zh-CN" w:val="en-US"/>
+        <w:lang w:bidi="ar-SA" w:eastAsia="en-US" w:val="en-US"/>
       </w:rPr>
     </w:rPrDefault>
     <w:pPrDefault>
@@ -945,10 +914,10 @@
     <w:name w:val="Body Text"/>
     <w:basedOn w:val="Normal"/>
     <w:link w:val="BodyTextChar"/>
-    <w:qFormat/>
     <w:pPr>
       <w:spacing w:after="180" w:before="180"/>
     </w:pPr>
+    <w:qFormat/>
   </w:style>
   <w:style w:customStyle="1" w:styleId="FirstParagraph" w:type="paragraph">
     <w:name w:val="First Paragraph"/>
@@ -968,94 +937,57 @@
     <w:name w:val="Title"/>
     <w:basedOn w:val="Normal"/>
     <w:next w:val="BodyText"/>
-    <w:link w:val="TitleChar"/>
-    <w:uiPriority w:val="10"/>
-    <w:qFormat/>
-    <w:rsid w:val="00A10FD9"/>
-    <w:pPr>
-      <w:spacing w:after="80" w:line="240" w:lineRule="auto"/>
-      <w:contextualSpacing/>
+    <w:qFormat/>
+    <w:pPr>
+      <w:keepNext/>
+      <w:keepLines/>
+      <w:spacing w:after="240" w:before="480"/>
       <w:jc w:val="center"/>
     </w:pPr>
     <w:rPr>
       <w:rFonts w:asciiTheme="majorHAnsi" w:cstheme="majorBidi" w:eastAsiaTheme="majorEastAsia" w:hAnsiTheme="majorHAnsi"/>
-      <w:sz w:val="56"/>
-      <w:szCs w:val="56"/>
-    </w:rPr>
-  </w:style>
-  <w:style w:customStyle="1" w:styleId="TitleChar" w:type="character">
-    <w:name w:val="Title Char"/>
-    <w:basedOn w:val="DefaultParagraphFont"/>
-    <w:link w:val="Title"/>
-    <w:uiPriority w:val="10"/>
-    <w:rsid w:val="00A10FD9"/>
-    <w:rPr>
-      <w:rFonts w:asciiTheme="majorHAnsi" w:cstheme="majorBidi" w:eastAsiaTheme="majorEastAsia" w:hAnsiTheme="majorHAnsi"/>
-      <w:sz w:val="56"/>
-      <w:szCs w:val="56"/>
+      <w:b/>
+      <w:bCs/>
+      <w:color w:themeColor="accent1" w:themeShade="B5" w:val="345A8A"/>
+      <w:sz w:val="36"/>
+      <w:szCs w:val="36"/>
     </w:rPr>
   </w:style>
   <w:style w:styleId="Subtitle" w:type="paragraph">
     <w:name w:val="Subtitle"/>
     <w:basedOn w:val="Title"/>
     <w:next w:val="BodyText"/>
-    <w:link w:val="SubtitleChar"/>
-    <w:uiPriority w:val="11"/>
-    <w:qFormat/>
-    <w:rsid w:val="00A10FD9"/>
-    <w:pPr>
-      <w:numPr>
-        <w:ilvl w:val="1"/>
-      </w:numPr>
-    </w:pPr>
-    <w:rPr>
-      <w:rFonts w:cstheme="majorBidi" w:eastAsiaTheme="majorEastAsia"/>
-      <w:spacing w:val="15"/>
-      <w:sz w:val="28"/>
-      <w:szCs w:val="28"/>
-    </w:rPr>
-  </w:style>
-  <w:style w:customStyle="1" w:styleId="SubtitleChar" w:type="character">
-    <w:name w:val="Subtitle Char"/>
-    <w:basedOn w:val="DefaultParagraphFont"/>
-    <w:link w:val="Subtitle"/>
-    <w:uiPriority w:val="11"/>
-    <w:rsid w:val="00A10FD9"/>
-    <w:rPr>
-      <w:rFonts w:cstheme="majorBidi" w:eastAsiaTheme="majorEastAsia"/>
-      <w:color w:themeColor="text1" w:themeTint="A6" w:val="595959"/>
-      <w:spacing w:val="15"/>
-      <w:sz w:val="28"/>
-      <w:szCs w:val="28"/>
+    <w:qFormat/>
+    <w:pPr>
+      <w:keepNext/>
+      <w:keepLines/>
+      <w:spacing w:after="240" w:before="240"/>
+      <w:jc w:val="center"/>
+    </w:pPr>
+    <w:rPr>
+      <w:sz w:val="30"/>
+      <w:szCs w:val="30"/>
     </w:rPr>
   </w:style>
   <w:style w:customStyle="1" w:styleId="Author" w:type="paragraph">
     <w:name w:val="Author"/>
-    <w:basedOn w:val="Title"/>
     <w:next w:val="BodyText"/>
     <w:qFormat/>
     <w:pPr>
       <w:keepNext/>
       <w:keepLines/>
-    </w:pPr>
-    <w:rPr>
-      <w:sz w:val="24"/>
-      <w:szCs w:val="24"/>
-    </w:rPr>
+      <w:jc w:val="center"/>
+    </w:pPr>
   </w:style>
   <w:style w:styleId="Date" w:type="paragraph">
     <w:name w:val="Date"/>
-    <w:basedOn w:val="Title"/>
     <w:next w:val="BodyText"/>
     <w:qFormat/>
     <w:pPr>
       <w:keepNext/>
       <w:keepLines/>
-    </w:pPr>
-    <w:rPr>
-      <w:sz w:val="24"/>
-      <w:szCs w:val="24"/>
-    </w:rPr>
+      <w:jc w:val="center"/>
+    </w:pPr>
   </w:style>
   <w:style w:customStyle="1" w:styleId="AbstractTitle" w:type="paragraph">
     <w:name w:val="Abstract Title"/>
@@ -1065,13 +997,15 @@
     <w:pPr>
       <w:keepNext/>
       <w:keepLines/>
+      <w:jc w:val="center"/>
       <w:spacing w:after="0" w:before="300"/>
-      <w:jc w:val="center"/>
-    </w:pPr>
-    <w:rPr>
-      <w:b/>
+    </w:pPr>
+    <w:rPr>
       <w:sz w:val="20"/>
       <w:szCs w:val="20"/>
+      <w:b/>
+      <w:color w:val="345A8A"/>
+      &gt;
     </w:rPr>
   </w:style>
   <w:style w:customStyle="1" w:styleId="Abstract" w:type="paragraph">
@@ -1098,321 +1032,191 @@
     <w:rPr/>
   </w:style>
   <w:style w:styleId="Heading1" w:type="paragraph">
-    <w:name w:val="heading 1"/>
+    <w:name w:val="Heading 1"/>
     <w:basedOn w:val="Normal"/>
     <w:next w:val="BodyText"/>
-    <w:link w:val="Heading1Char"/>
     <w:uiPriority w:val="9"/>
     <w:qFormat/>
-    <w:rsid w:val="00A10FD9"/>
     <w:pPr>
       <w:keepNext/>
       <w:keepLines/>
-      <w:spacing w:after="80" w:before="360"/>
+      <w:spacing w:after="0" w:before="480"/>
       <w:outlineLvl w:val="0"/>
     </w:pPr>
     <w:rPr>
       <w:rFonts w:asciiTheme="majorHAnsi" w:cstheme="majorBidi" w:eastAsiaTheme="majorEastAsia" w:hAnsiTheme="majorHAnsi"/>
-      <w:color w:themeColor="accent1" w:themeShade="BF" w:val="0F4761"/>
-      <w:sz w:val="40"/>
-      <w:szCs w:val="40"/>
+      <w:b/>
+      <w:bCs/>
+      <w:color w:themeColor="accent1" w:val="4F81BD"/>
+      <w:sz w:val="32"/>
+      <w:szCs w:val="32"/>
     </w:rPr>
   </w:style>
   <w:style w:styleId="Heading2" w:type="paragraph">
-    <w:name w:val="heading 2"/>
+    <w:name w:val="Heading 2"/>
     <w:basedOn w:val="Normal"/>
     <w:next w:val="BodyText"/>
-    <w:link w:val="Heading2Char"/>
     <w:uiPriority w:val="9"/>
-    <w:semiHidden/>
     <w:unhideWhenUsed/>
     <w:qFormat/>
-    <w:rsid w:val="00A10FD9"/>
     <w:pPr>
       <w:keepNext/>
       <w:keepLines/>
-      <w:spacing w:after="80" w:before="160"/>
+      <w:spacing w:after="0" w:before="200"/>
       <w:outlineLvl w:val="1"/>
     </w:pPr>
     <w:rPr>
       <w:rFonts w:asciiTheme="majorHAnsi" w:cstheme="majorBidi" w:eastAsiaTheme="majorEastAsia" w:hAnsiTheme="majorHAnsi"/>
-      <w:color w:themeColor="accent1" w:themeShade="BF" w:val="0F4761"/>
-      <w:sz w:val="32"/>
-      <w:szCs w:val="32"/>
+      <w:b/>
+      <w:bCs/>
+      <w:color w:themeColor="accent1" w:val="4F81BD"/>
+      <w:sz w:val="28"/>
+      <w:szCs w:val="28"/>
     </w:rPr>
   </w:style>
   <w:style w:styleId="Heading3" w:type="paragraph">
-    <w:name w:val="heading 3"/>
+    <w:name w:val="Heading 3"/>
     <w:basedOn w:val="Normal"/>
     <w:next w:val="BodyText"/>
-    <w:link w:val="Heading3Char"/>
     <w:uiPriority w:val="9"/>
-    <w:semiHidden/>
     <w:unhideWhenUsed/>
     <w:qFormat/>
-    <w:rsid w:val="00A10FD9"/>
     <w:pPr>
       <w:keepNext/>
       <w:keepLines/>
-      <w:spacing w:after="80" w:before="160"/>
+      <w:spacing w:after="0" w:before="200"/>
       <w:outlineLvl w:val="2"/>
     </w:pPr>
     <w:rPr>
-      <w:rFonts w:cstheme="majorBidi" w:eastAsiaTheme="majorEastAsia"/>
-      <w:color w:themeColor="accent1" w:themeShade="BF" w:val="0F4761"/>
-      <w:sz w:val="28"/>
-      <w:szCs w:val="28"/>
+      <w:rFonts w:asciiTheme="majorHAnsi" w:cstheme="majorBidi" w:eastAsiaTheme="majorEastAsia" w:hAnsiTheme="majorHAnsi"/>
+      <w:b/>
+      <w:bCs/>
+      <w:color w:themeColor="accent1" w:val="4F81BD"/>
+      <w:sz w:val="24"/>
+      <w:szCs w:val="24"/>
     </w:rPr>
   </w:style>
   <w:style w:styleId="Heading4" w:type="paragraph">
-    <w:name w:val="heading 4"/>
+    <w:name w:val="Heading 4"/>
     <w:basedOn w:val="Normal"/>
     <w:next w:val="BodyText"/>
-    <w:link w:val="Heading4Char"/>
     <w:uiPriority w:val="9"/>
-    <w:semiHidden/>
     <w:unhideWhenUsed/>
     <w:qFormat/>
-    <w:rsid w:val="00A10FD9"/>
     <w:pPr>
       <w:keepNext/>
       <w:keepLines/>
-      <w:spacing w:after="40" w:before="80"/>
+      <w:spacing w:after="0" w:before="200"/>
       <w:outlineLvl w:val="3"/>
     </w:pPr>
     <w:rPr>
-      <w:rFonts w:cstheme="majorBidi" w:eastAsiaTheme="majorEastAsia"/>
+      <w:rFonts w:asciiTheme="majorHAnsi" w:cstheme="majorBidi" w:eastAsiaTheme="majorEastAsia" w:hAnsiTheme="majorHAnsi"/>
       <w:i/>
-      <w:iCs/>
-      <w:color w:themeColor="accent1" w:themeShade="BF" w:val="0F4761"/>
+      <w:bCs/>
+      <w:color w:themeColor="accent1" w:val="4F81BD"/>
+      <w:sz w:val="24"/>
+      <w:szCs w:val="24"/>
     </w:rPr>
   </w:style>
   <w:style w:styleId="Heading5" w:type="paragraph">
-    <w:name w:val="heading 5"/>
+    <w:name w:val="Heading 5"/>
     <w:basedOn w:val="Normal"/>
     <w:next w:val="BodyText"/>
-    <w:link w:val="Heading5Char"/>
     <w:uiPriority w:val="9"/>
-    <w:semiHidden/>
     <w:unhideWhenUsed/>
     <w:qFormat/>
-    <w:rsid w:val="00A10FD9"/>
     <w:pPr>
       <w:keepNext/>
       <w:keepLines/>
-      <w:spacing w:after="40" w:before="80"/>
+      <w:spacing w:after="0" w:before="200"/>
       <w:outlineLvl w:val="4"/>
     </w:pPr>
     <w:rPr>
-      <w:rFonts w:cstheme="majorBidi" w:eastAsiaTheme="majorEastAsia"/>
-      <w:color w:themeColor="accent1" w:themeShade="BF" w:val="0F4761"/>
+      <w:rFonts w:asciiTheme="majorHAnsi" w:cstheme="majorBidi" w:eastAsiaTheme="majorEastAsia" w:hAnsiTheme="majorHAnsi"/>
+      <w:iCs/>
+      <w:color w:themeColor="accent1" w:val="4F81BD"/>
+      <w:sz w:val="24"/>
+      <w:szCs w:val="24"/>
     </w:rPr>
   </w:style>
   <w:style w:styleId="Heading6" w:type="paragraph">
-    <w:name w:val="heading 6"/>
+    <w:name w:val="Heading 6"/>
     <w:basedOn w:val="Normal"/>
     <w:next w:val="BodyText"/>
-    <w:link w:val="Heading6Char"/>
     <w:uiPriority w:val="9"/>
-    <w:semiHidden/>
     <w:unhideWhenUsed/>
     <w:qFormat/>
-    <w:rsid w:val="00A10FD9"/>
     <w:pPr>
       <w:keepNext/>
       <w:keepLines/>
-      <w:spacing w:after="0" w:before="40"/>
+      <w:spacing w:after="0" w:before="200"/>
       <w:outlineLvl w:val="5"/>
     </w:pPr>
     <w:rPr>
-      <w:rFonts w:cstheme="majorBidi" w:eastAsiaTheme="majorEastAsia"/>
-      <w:i/>
-      <w:iCs/>
-      <w:color w:themeColor="text1" w:themeTint="A6" w:val="595959"/>
+      <w:rFonts w:asciiTheme="majorHAnsi" w:cstheme="majorBidi" w:eastAsiaTheme="majorEastAsia" w:hAnsiTheme="majorHAnsi"/>
+      <w:color w:themeColor="accent1" w:val="4F81BD"/>
+      <w:sz w:val="24"/>
+      <w:szCs w:val="24"/>
     </w:rPr>
   </w:style>
   <w:style w:styleId="Heading7" w:type="paragraph">
-    <w:name w:val="heading 7"/>
+    <w:name w:val="Heading 7"/>
     <w:basedOn w:val="Normal"/>
     <w:next w:val="BodyText"/>
-    <w:link w:val="Heading7Char"/>
     <w:uiPriority w:val="9"/>
-    <w:semiHidden/>
     <w:unhideWhenUsed/>
     <w:qFormat/>
-    <w:rsid w:val="00A10FD9"/>
     <w:pPr>
       <w:keepNext/>
       <w:keepLines/>
-      <w:spacing w:after="0" w:before="40"/>
+      <w:spacing w:after="0" w:before="200"/>
       <w:outlineLvl w:val="6"/>
     </w:pPr>
     <w:rPr>
-      <w:rFonts w:cstheme="majorBidi" w:eastAsiaTheme="majorEastAsia"/>
-      <w:color w:themeColor="text1" w:themeTint="A6" w:val="595959"/>
+      <w:rFonts w:asciiTheme="majorHAnsi" w:cstheme="majorBidi" w:eastAsiaTheme="majorEastAsia" w:hAnsiTheme="majorHAnsi"/>
+      <w:color w:themeColor="accent1" w:val="4F81BD"/>
+      <w:sz w:val="24"/>
+      <w:szCs w:val="24"/>
     </w:rPr>
   </w:style>
   <w:style w:styleId="Heading8" w:type="paragraph">
-    <w:name w:val="heading 8"/>
+    <w:name w:val="Heading 8"/>
     <w:basedOn w:val="Normal"/>
     <w:next w:val="BodyText"/>
-    <w:link w:val="Heading8Char"/>
     <w:uiPriority w:val="9"/>
-    <w:semiHidden/>
     <w:unhideWhenUsed/>
     <w:qFormat/>
-    <w:rsid w:val="00A10FD9"/>
     <w:pPr>
       <w:keepNext/>
       <w:keepLines/>
-      <w:spacing w:after="0"/>
+      <w:spacing w:after="0" w:before="200"/>
       <w:outlineLvl w:val="7"/>
     </w:pPr>
     <w:rPr>
-      <w:rFonts w:cstheme="majorBidi" w:eastAsiaTheme="majorEastAsia"/>
-      <w:i/>
-      <w:iCs/>
-      <w:color w:themeColor="text1" w:themeTint="D8" w:val="272727"/>
+      <w:rFonts w:asciiTheme="majorHAnsi" w:cstheme="majorBidi" w:eastAsiaTheme="majorEastAsia" w:hAnsiTheme="majorHAnsi"/>
+      <w:color w:themeColor="accent1" w:val="4F81BD"/>
+      <w:sz w:val="24"/>
+      <w:szCs w:val="24"/>
     </w:rPr>
   </w:style>
   <w:style w:styleId="Heading9" w:type="paragraph">
-    <w:name w:val="heading 9"/>
+    <w:name w:val="Heading 9"/>
     <w:basedOn w:val="Normal"/>
     <w:next w:val="BodyText"/>
-    <w:link w:val="Heading9Char"/>
     <w:uiPriority w:val="9"/>
-    <w:semiHidden/>
     <w:unhideWhenUsed/>
     <w:qFormat/>
-    <w:rsid w:val="00A10FD9"/>
     <w:pPr>
       <w:keepNext/>
       <w:keepLines/>
-      <w:spacing w:after="0"/>
+      <w:spacing w:after="0" w:before="200"/>
       <w:outlineLvl w:val="8"/>
     </w:pPr>
     <w:rPr>
-      <w:rFonts w:cstheme="majorBidi" w:eastAsiaTheme="majorEastAsia"/>
-      <w:color w:themeColor="text1" w:themeTint="D8" w:val="272727"/>
-    </w:rPr>
-  </w:style>
-  <w:style w:customStyle="1" w:styleId="Heading1Char" w:type="character">
-    <w:name w:val="Heading 1 Char"/>
-    <w:basedOn w:val="DefaultParagraphFont"/>
-    <w:link w:val="Heading1"/>
-    <w:uiPriority w:val="9"/>
-    <w:rsid w:val="00A10FD9"/>
-    <w:rPr>
       <w:rFonts w:asciiTheme="majorHAnsi" w:cstheme="majorBidi" w:eastAsiaTheme="majorEastAsia" w:hAnsiTheme="majorHAnsi"/>
-      <w:color w:themeColor="accent1" w:themeShade="BF" w:val="0F4761"/>
-      <w:sz w:val="40"/>
-      <w:szCs w:val="40"/>
-    </w:rPr>
-  </w:style>
-  <w:style w:customStyle="1" w:styleId="Heading2Char" w:type="character">
-    <w:name w:val="Heading 2 Char"/>
-    <w:basedOn w:val="DefaultParagraphFont"/>
-    <w:link w:val="Heading2"/>
-    <w:uiPriority w:val="9"/>
-    <w:semiHidden/>
-    <w:rsid w:val="00A10FD9"/>
-    <w:rPr>
-      <w:rFonts w:asciiTheme="majorHAnsi" w:cstheme="majorBidi" w:eastAsiaTheme="majorEastAsia" w:hAnsiTheme="majorHAnsi"/>
-      <w:color w:themeColor="accent1" w:themeShade="BF" w:val="0F4761"/>
-      <w:sz w:val="32"/>
-      <w:szCs w:val="32"/>
-    </w:rPr>
-  </w:style>
-  <w:style w:customStyle="1" w:styleId="Heading3Char" w:type="character">
-    <w:name w:val="Heading 3 Char"/>
-    <w:basedOn w:val="DefaultParagraphFont"/>
-    <w:link w:val="Heading3"/>
-    <w:uiPriority w:val="9"/>
-    <w:semiHidden/>
-    <w:rsid w:val="00A10FD9"/>
-    <w:rPr>
-      <w:rFonts w:cstheme="majorBidi" w:eastAsiaTheme="majorEastAsia"/>
-      <w:color w:themeColor="accent1" w:themeShade="BF" w:val="0F4761"/>
-      <w:sz w:val="28"/>
-      <w:szCs w:val="28"/>
-    </w:rPr>
-  </w:style>
-  <w:style w:customStyle="1" w:styleId="Heading4Char" w:type="character">
-    <w:name w:val="Heading 4 Char"/>
-    <w:basedOn w:val="DefaultParagraphFont"/>
-    <w:link w:val="Heading4"/>
-    <w:uiPriority w:val="9"/>
-    <w:semiHidden/>
-    <w:rsid w:val="00A10FD9"/>
-    <w:rPr>
-      <w:rFonts w:cstheme="majorBidi" w:eastAsiaTheme="majorEastAsia"/>
-      <w:i/>
-      <w:iCs/>
-      <w:color w:themeColor="accent1" w:themeShade="BF" w:val="0F4761"/>
-    </w:rPr>
-  </w:style>
-  <w:style w:customStyle="1" w:styleId="Heading5Char" w:type="character">
-    <w:name w:val="Heading 5 Char"/>
-    <w:basedOn w:val="DefaultParagraphFont"/>
-    <w:link w:val="Heading5"/>
-    <w:uiPriority w:val="9"/>
-    <w:semiHidden/>
-    <w:rsid w:val="00A10FD9"/>
-    <w:rPr>
-      <w:rFonts w:cstheme="majorBidi" w:eastAsiaTheme="majorEastAsia"/>
-      <w:color w:themeColor="accent1" w:themeShade="BF" w:val="0F4761"/>
-    </w:rPr>
-  </w:style>
-  <w:style w:customStyle="1" w:styleId="Heading6Char" w:type="character">
-    <w:name w:val="Heading 6 Char"/>
-    <w:basedOn w:val="DefaultParagraphFont"/>
-    <w:link w:val="Heading6"/>
-    <w:uiPriority w:val="9"/>
-    <w:semiHidden/>
-    <w:rsid w:val="00A10FD9"/>
-    <w:rPr>
-      <w:rFonts w:cstheme="majorBidi" w:eastAsiaTheme="majorEastAsia"/>
-      <w:i/>
-      <w:iCs/>
-      <w:color w:themeColor="text1" w:themeTint="A6" w:val="595959"/>
-    </w:rPr>
-  </w:style>
-  <w:style w:customStyle="1" w:styleId="Heading7Char" w:type="character">
-    <w:name w:val="Heading 7 Char"/>
-    <w:basedOn w:val="DefaultParagraphFont"/>
-    <w:link w:val="Heading7"/>
-    <w:uiPriority w:val="9"/>
-    <w:semiHidden/>
-    <w:rsid w:val="00A10FD9"/>
-    <w:rPr>
-      <w:rFonts w:cstheme="majorBidi" w:eastAsiaTheme="majorEastAsia"/>
-      <w:color w:themeColor="text1" w:themeTint="A6" w:val="595959"/>
-    </w:rPr>
-  </w:style>
-  <w:style w:customStyle="1" w:styleId="Heading8Char" w:type="character">
-    <w:name w:val="Heading 8 Char"/>
-    <w:basedOn w:val="DefaultParagraphFont"/>
-    <w:link w:val="Heading8"/>
-    <w:uiPriority w:val="9"/>
-    <w:semiHidden/>
-    <w:rsid w:val="00A10FD9"/>
-    <w:rPr>
-      <w:rFonts w:cstheme="majorBidi" w:eastAsiaTheme="majorEastAsia"/>
-      <w:i/>
-      <w:iCs/>
-      <w:color w:themeColor="text1" w:themeTint="D8" w:val="272727"/>
-    </w:rPr>
-  </w:style>
-  <w:style w:customStyle="1" w:styleId="Heading9Char" w:type="character">
-    <w:name w:val="Heading 9 Char"/>
-    <w:basedOn w:val="DefaultParagraphFont"/>
-    <w:link w:val="Heading9"/>
-    <w:uiPriority w:val="9"/>
-    <w:semiHidden/>
-    <w:rsid w:val="00A10FD9"/>
-    <w:rPr>
-      <w:rFonts w:cstheme="majorBidi" w:eastAsiaTheme="majorEastAsia"/>
-      <w:color w:themeColor="text1" w:themeTint="D8" w:val="272727"/>
+      <w:color w:themeColor="accent1" w:val="4F81BD"/>
+      <w:sz w:val="24"/>
+      <w:szCs w:val="24"/>
     </w:rPr>
   </w:style>
   <w:style w:styleId="BlockText" w:type="paragraph">
@@ -1434,18 +1238,6 @@
     <w:uiPriority w:val="9"/>
     <w:unhideWhenUsed/>
     <w:qFormat/>
-  </w:style>
-  <w:style w:styleId="FootnoteBlockText" w:type="paragraph">
-    <w:name w:val="Footnote Block Text"/>
-    <w:basedOn w:val="FootnoteText"/>
-    <w:next w:val="FootnoteText"/>
-    <w:uiPriority w:val="9"/>
-    <w:unhideWhenUsed/>
-    <w:qFormat/>
-    <w:pPr>
-      <w:spacing w:after="100" w:before="100"/>
-      <w:ind w:firstLine="0" w:left="480" w:right="480"/>
-    </w:pPr>
   </w:style>
   <w:style w:default="1" w:styleId="DefaultParagraphFont" w:type="character">
     <w:name w:val="Default Paragraph Font"/>
@@ -1468,11 +1260,18 @@
       </w:tblCellMar>
     </w:tblPr>
     <w:tblStylePr w:type="firstRow">
+      <w:tblPr>
+        <w:jc w:val="left"/>
+        <w:tblInd w:type="dxa" w:w="0"/>
+      </w:tblPr>
+      <w:trPr>
+        <w:jc w:val="left"/>
+      </w:trPr>
       <w:tcPr>
+        <w:vAlign w:val="bottom"/>
         <w:tcBorders>
           <w:bottom w:val="single"/>
         </w:tcBorders>
-        <w:vAlign w:val="bottom"/>
       </w:tcPr>
     </w:tblStylePr>
   </w:style>
@@ -1587,8 +1386,8 @@
     <w:name w:val="KeywordTok"/>
     <w:basedOn w:val="VerbatimChar"/>
     <w:rPr>
+      <w:color w:val="007020"/>
       <w:b/>
-      <w:color w:val="007020"/>
     </w:rPr>
   </w:style>
   <w:style w:type="character" w:customStyle="1" w:styleId="DataTypeTok">
@@ -1665,42 +1464,42 @@
     <w:name w:val="ImportTok"/>
     <w:basedOn w:val="VerbatimChar"/>
     <w:rPr>
+      <w:color w:val="008000"/>
       <w:b/>
-      <w:color w:val="008000"/>
     </w:rPr>
   </w:style>
   <w:style w:type="character" w:customStyle="1" w:styleId="CommentTok">
     <w:name w:val="CommentTok"/>
     <w:basedOn w:val="VerbatimChar"/>
     <w:rPr>
+      <w:color w:val="60a0b0"/>
       <w:i/>
-      <w:color w:val="60a0b0"/>
     </w:rPr>
   </w:style>
   <w:style w:type="character" w:customStyle="1" w:styleId="DocumentationTok">
     <w:name w:val="DocumentationTok"/>
     <w:basedOn w:val="VerbatimChar"/>
     <w:rPr>
+      <w:color w:val="ba2121"/>
       <w:i/>
-      <w:color w:val="ba2121"/>
     </w:rPr>
   </w:style>
   <w:style w:type="character" w:customStyle="1" w:styleId="AnnotationTok">
     <w:name w:val="AnnotationTok"/>
     <w:basedOn w:val="VerbatimChar"/>
     <w:rPr>
+      <w:color w:val="60a0b0"/>
       <w:b/>
       <w:i/>
-      <w:color w:val="60a0b0"/>
     </w:rPr>
   </w:style>
   <w:style w:type="character" w:customStyle="1" w:styleId="CommentVarTok">
     <w:name w:val="CommentVarTok"/>
     <w:basedOn w:val="VerbatimChar"/>
     <w:rPr>
+      <w:color w:val="60a0b0"/>
       <w:b/>
       <w:i/>
-      <w:color w:val="60a0b0"/>
     </w:rPr>
   </w:style>
   <w:style w:type="character" w:customStyle="1" w:styleId="OtherTok">
@@ -1728,8 +1527,8 @@
     <w:name w:val="ControlFlowTok"/>
     <w:basedOn w:val="VerbatimChar"/>
     <w:rPr>
+      <w:color w:val="007020"/>
       <w:b/>
-      <w:color w:val="007020"/>
     </w:rPr>
   </w:style>
   <w:style w:type="character" w:customStyle="1" w:styleId="OperatorTok">
@@ -1774,34 +1573,34 @@
     <w:name w:val="InformationTok"/>
     <w:basedOn w:val="VerbatimChar"/>
     <w:rPr>
+      <w:color w:val="60a0b0"/>
       <w:b/>
       <w:i/>
-      <w:color w:val="60a0b0"/>
     </w:rPr>
   </w:style>
   <w:style w:type="character" w:customStyle="1" w:styleId="WarningTok">
     <w:name w:val="WarningTok"/>
     <w:basedOn w:val="VerbatimChar"/>
     <w:rPr>
+      <w:color w:val="60a0b0"/>
       <w:b/>
       <w:i/>
-      <w:color w:val="60a0b0"/>
     </w:rPr>
   </w:style>
   <w:style w:type="character" w:customStyle="1" w:styleId="AlertTok">
     <w:name w:val="AlertTok"/>
     <w:basedOn w:val="VerbatimChar"/>
     <w:rPr>
+      <w:color w:val="ff0000"/>
       <w:b/>
-      <w:color w:val="ff0000"/>
     </w:rPr>
   </w:style>
   <w:style w:type="character" w:customStyle="1" w:styleId="ErrorTok">
     <w:name w:val="ErrorTok"/>
     <w:basedOn w:val="VerbatimChar"/>
     <w:rPr>
+      <w:color w:val="ff0000"/>
       <w:b/>
-      <w:color w:val="ff0000"/>
     </w:rPr>
   </w:style>
   <w:style w:type="character" w:customStyle="1" w:styleId="NormalTok">
@@ -1823,44 +1622,44 @@
         <a:sysClr val="window" lastClr="FFFFFF"/>
       </a:lt1>
       <a:dk2>
-        <a:srgbClr val="0E2841"/>
+        <a:srgbClr val="1F497D"/>
       </a:dk2>
       <a:lt2>
-        <a:srgbClr val="E8E8E8"/>
+        <a:srgbClr val="EEECE1"/>
       </a:lt2>
       <a:accent1>
-        <a:srgbClr val="156082"/>
+        <a:srgbClr val="4F81BD"/>
       </a:accent1>
       <a:accent2>
-        <a:srgbClr val="E97132"/>
+        <a:srgbClr val="C0504D"/>
       </a:accent2>
       <a:accent3>
-        <a:srgbClr val="196B24"/>
+        <a:srgbClr val="9BBB59"/>
       </a:accent3>
       <a:accent4>
-        <a:srgbClr val="0F9ED5"/>
+        <a:srgbClr val="8064A2"/>
       </a:accent4>
       <a:accent5>
-        <a:srgbClr val="A02B93"/>
+        <a:srgbClr val="4BACC6"/>
       </a:accent5>
       <a:accent6>
-        <a:srgbClr val="4EA72E"/>
+        <a:srgbClr val="F79646"/>
       </a:accent6>
       <a:hlink>
-        <a:srgbClr val="467886"/>
+        <a:srgbClr val="0000FF"/>
       </a:hlink>
       <a:folHlink>
-        <a:srgbClr val="96607D"/>
+        <a:srgbClr val="800080"/>
       </a:folHlink>
     </a:clrScheme>
     <a:fontScheme name="Office">
       <a:majorFont>
-        <a:latin typeface="Aptos Display" panose="02110004020202020204"/>
+        <a:latin typeface="Calibri"/>
         <a:ea typeface=""/>
         <a:cs typeface=""/>
-        <a:font script="Jpan" typeface="游ゴシック Light"/>
+        <a:font script="Jpan" typeface="ＭＳ ゴシック"/>
         <a:font script="Hang" typeface="맑은 고딕"/>
-        <a:font script="Hans" typeface="等线 Light"/>
+        <a:font script="Hans" typeface="宋体"/>
         <a:font script="Hant" typeface="新細明體"/>
         <a:font script="Arab" typeface="Times New Roman"/>
         <a:font script="Hebr" typeface="Times New Roman"/>
@@ -1887,32 +1686,14 @@
         <a:font script="Mong" typeface="Mongolian Baiti"/>
         <a:font script="Viet" typeface="Times New Roman"/>
         <a:font script="Uigh" typeface="Microsoft Uighur"/>
-        <a:font script="Geor" typeface="Sylfaen"/>
-        <a:font script="Armn" typeface="Arial"/>
-        <a:font script="Bugi" typeface="Leelawadee UI"/>
-        <a:font script="Bopo" typeface="Microsoft JhengHei"/>
-        <a:font script="Java" typeface="Javanese Text"/>
-        <a:font script="Lisu" typeface="Segoe UI"/>
-        <a:font script="Mymr" typeface="Myanmar Text"/>
-        <a:font script="Nkoo" typeface="Ebrima"/>
-        <a:font script="Olck" typeface="Nirmala UI"/>
-        <a:font script="Osma" typeface="Ebrima"/>
-        <a:font script="Phag" typeface="Phagspa"/>
-        <a:font script="Syrn" typeface="Estrangelo Edessa"/>
-        <a:font script="Syrj" typeface="Estrangelo Edessa"/>
-        <a:font script="Syre" typeface="Estrangelo Edessa"/>
-        <a:font script="Sora" typeface="Nirmala UI"/>
-        <a:font script="Tale" typeface="Microsoft Tai Le"/>
-        <a:font script="Talu" typeface="Microsoft New Tai Lue"/>
-        <a:font script="Tfng" typeface="Ebrima"/>
       </a:majorFont>
       <a:minorFont>
-        <a:latin typeface="Aptos" panose="02110004020202020204"/>
+        <a:latin typeface="Cambria"/>
         <a:ea typeface=""/>
         <a:cs typeface=""/>
-        <a:font script="Jpan" typeface="游明朝"/>
+        <a:font script="Jpan" typeface="ＭＳ 明朝"/>
         <a:font script="Hang" typeface="맑은 고딕"/>
-        <a:font script="Hans" typeface="等线"/>
+        <a:font script="Hans" typeface="宋体"/>
         <a:font script="Hant" typeface="新細明體"/>
         <a:font script="Arab" typeface="Arial"/>
         <a:font script="Hebr" typeface="Arial"/>
@@ -1939,24 +1720,6 @@
         <a:font script="Mong" typeface="Mongolian Baiti"/>
         <a:font script="Viet" typeface="Arial"/>
         <a:font script="Uigh" typeface="Microsoft Uighur"/>
-        <a:font script="Geor" typeface="Sylfaen"/>
-        <a:font script="Armn" typeface="Arial"/>
-        <a:font script="Bugi" typeface="Leelawadee UI"/>
-        <a:font script="Bopo" typeface="Microsoft JhengHei"/>
-        <a:font script="Java" typeface="Javanese Text"/>
-        <a:font script="Lisu" typeface="Segoe UI"/>
-        <a:font script="Mymr" typeface="Myanmar Text"/>
-        <a:font script="Nkoo" typeface="Ebrima"/>
-        <a:font script="Olck" typeface="Nirmala UI"/>
-        <a:font script="Osma" typeface="Ebrima"/>
-        <a:font script="Phag" typeface="Phagspa"/>
-        <a:font script="Syrn" typeface="Estrangelo Edessa"/>
-        <a:font script="Syrj" typeface="Estrangelo Edessa"/>
-        <a:font script="Syre" typeface="Estrangelo Edessa"/>
-        <a:font script="Sora" typeface="Nirmala UI"/>
-        <a:font script="Tale" typeface="Microsoft Tai Le"/>
-        <a:font script="Talu" typeface="Microsoft New Tai Lue"/>
-        <a:font script="Tfng" typeface="Ebrima"/>
       </a:minorFont>
     </a:fontScheme>
     <a:fmtScheme name="Office">
@@ -1968,141 +1731,200 @@
           <a:gsLst>
             <a:gs pos="0">
               <a:schemeClr val="phClr">
-                <a:lumMod val="110000"/>
-                <a:satMod val="105000"/>
-                <a:tint val="67000"/>
+                <a:tint val="50000"/>
+                <a:satMod val="300000"/>
               </a:schemeClr>
             </a:gs>
-            <a:gs pos="50000">
+            <a:gs pos="35000">
               <a:schemeClr val="phClr">
-                <a:lumMod val="105000"/>
-                <a:satMod val="103000"/>
-                <a:tint val="73000"/>
+                <a:tint val="37000"/>
+                <a:satMod val="300000"/>
               </a:schemeClr>
             </a:gs>
             <a:gs pos="100000">
               <a:schemeClr val="phClr">
-                <a:lumMod val="105000"/>
-                <a:satMod val="109000"/>
-                <a:tint val="81000"/>
+                <a:tint val="15000"/>
+                <a:satMod val="350000"/>
               </a:schemeClr>
             </a:gs>
           </a:gsLst>
-          <a:lin ang="5400000" scaled="0"/>
+          <a:lin ang="16200000" scaled="1"/>
         </a:gradFill>
         <a:gradFill rotWithShape="1">
           <a:gsLst>
             <a:gs pos="0">
               <a:schemeClr val="phClr">
-                <a:satMod val="103000"/>
-                <a:lumMod val="102000"/>
-                <a:tint val="94000"/>
-              </a:schemeClr>
-            </a:gs>
-            <a:gs pos="50000">
-              <a:schemeClr val="phClr">
-                <a:satMod val="110000"/>
-                <a:lumMod val="100000"/>
+                <a:tint val="100000"/>
                 <a:shade val="100000"/>
+                <a:satMod val="130000"/>
               </a:schemeClr>
             </a:gs>
             <a:gs pos="100000">
               <a:schemeClr val="phClr">
-                <a:lumMod val="99000"/>
-                <a:satMod val="120000"/>
-                <a:shade val="78000"/>
+                <a:tint val="50000"/>
+                <a:shade val="100000"/>
+                <a:satMod val="350000"/>
               </a:schemeClr>
             </a:gs>
           </a:gsLst>
-          <a:lin ang="5400000" scaled="0"/>
+          <a:lin ang="16200000" scaled="0"/>
         </a:gradFill>
       </a:fillStyleLst>
       <a:lnStyleLst>
-        <a:ln w="6350" cap="flat" cmpd="sng" algn="ctr">
+        <a:ln w="9525" cap="flat" cmpd="sng" algn="ctr">
+          <a:solidFill>
+            <a:schemeClr val="phClr">
+              <a:shade val="95000"/>
+              <a:satMod val="105000"/>
+            </a:schemeClr>
+          </a:solidFill>
+          <a:prstDash val="solid"/>
+        </a:ln>
+        <a:ln w="25400" cap="flat" cmpd="sng" algn="ctr">
           <a:solidFill>
             <a:schemeClr val="phClr"/>
           </a:solidFill>
           <a:prstDash val="solid"/>
-          <a:miter lim="800000"/>
         </a:ln>
-        <a:ln w="12700" cap="flat" cmpd="sng" algn="ctr">
+        <a:ln w="38100" cap="flat" cmpd="sng" algn="ctr">
           <a:solidFill>
             <a:schemeClr val="phClr"/>
           </a:solidFill>
           <a:prstDash val="solid"/>
-          <a:miter lim="800000"/>
-        </a:ln>
-        <a:ln w="19050" cap="flat" cmpd="sng" algn="ctr">
-          <a:solidFill>
-            <a:schemeClr val="phClr"/>
-          </a:solidFill>
-          <a:prstDash val="solid"/>
-          <a:miter lim="800000"/>
         </a:ln>
       </a:lnStyleLst>
       <a:effectStyleLst>
         <a:effectStyle>
-          <a:effectLst/>
-        </a:effectStyle>
-        <a:effectStyle>
-          <a:effectLst/>
+          <a:effectLst>
+            <a:outerShdw blurRad="40000" dist="20000" dir="5400000" rotWithShape="0">
+              <a:srgbClr val="000000">
+                <a:alpha val="38000"/>
+              </a:srgbClr>
+            </a:outerShdw>
+          </a:effectLst>
         </a:effectStyle>
         <a:effectStyle>
           <a:effectLst>
-            <a:outerShdw blurRad="57150" dist="19050" dir="5400000" algn="ctr" rotWithShape="0">
+            <a:outerShdw blurRad="40000" dist="23000" dir="5400000" rotWithShape="0">
               <a:srgbClr val="000000">
-                <a:alpha val="63000"/>
+                <a:alpha val="35000"/>
               </a:srgbClr>
             </a:outerShdw>
           </a:effectLst>
+        </a:effectStyle>
+        <a:effectStyle>
+          <a:effectLst>
+            <a:outerShdw blurRad="40000" dist="23000" dir="5400000" rotWithShape="0">
+              <a:srgbClr val="000000">
+                <a:alpha val="35000"/>
+              </a:srgbClr>
+            </a:outerShdw>
+          </a:effectLst>
+          <a:scene3d>
+            <a:camera prst="orthographicFront">
+              <a:rot lat="0" lon="0" rev="0"/>
+            </a:camera>
+            <a:lightRig rig="threePt" dir="t">
+              <a:rot lat="0" lon="0" rev="1200000"/>
+            </a:lightRig>
+          </a:scene3d>
+          <a:sp3d>
+            <a:bevelT w="63500" h="25400"/>
+          </a:sp3d>
         </a:effectStyle>
       </a:effectStyleLst>
       <a:bgFillStyleLst>
         <a:solidFill>
           <a:schemeClr val="phClr"/>
         </a:solidFill>
-        <a:solidFill>
-          <a:schemeClr val="phClr">
-            <a:tint val="95000"/>
-            <a:satMod val="170000"/>
-          </a:schemeClr>
-        </a:solidFill>
         <a:gradFill rotWithShape="1">
           <a:gsLst>
             <a:gs pos="0">
               <a:schemeClr val="phClr">
-                <a:tint val="93000"/>
-                <a:satMod val="150000"/>
-                <a:shade val="98000"/>
-                <a:lumMod val="102000"/>
+                <a:tint val="40000"/>
+                <a:satMod val="350000"/>
               </a:schemeClr>
             </a:gs>
-            <a:gs pos="50000">
+            <a:gs pos="40000">
               <a:schemeClr val="phClr">
-                <a:tint val="98000"/>
-                <a:satMod val="130000"/>
-                <a:shade val="90000"/>
-                <a:lumMod val="103000"/>
+                <a:tint val="45000"/>
+                <a:shade val="99000"/>
+                <a:satMod val="350000"/>
               </a:schemeClr>
             </a:gs>
             <a:gs pos="100000">
               <a:schemeClr val="phClr">
-                <a:shade val="63000"/>
-                <a:satMod val="120000"/>
+                <a:shade val="20000"/>
+                <a:satMod val="255000"/>
               </a:schemeClr>
             </a:gs>
           </a:gsLst>
-          <a:lin ang="5400000" scaled="0"/>
+          <a:path path="circle">
+            <a:fillToRect l="50000" t="-80000" r="50000" b="180000"/>
+          </a:path>
+        </a:gradFill>
+        <a:gradFill rotWithShape="1">
+          <a:gsLst>
+            <a:gs pos="0">
+              <a:schemeClr val="phClr">
+                <a:tint val="80000"/>
+                <a:satMod val="300000"/>
+              </a:schemeClr>
+            </a:gs>
+            <a:gs pos="100000">
+              <a:schemeClr val="phClr">
+                <a:shade val="30000"/>
+                <a:satMod val="200000"/>
+              </a:schemeClr>
+            </a:gs>
+          </a:gsLst>
+          <a:path path="circle">
+            <a:fillToRect l="50000" t="50000" r="50000" b="50000"/>
+          </a:path>
         </a:gradFill>
       </a:bgFillStyleLst>
     </a:fmtScheme>
   </a:themeElements>
-  <a:objectDefaults/>
+  <a:objectDefaults>
+    <a:spDef>
+      <a:spPr/>
+      <a:bodyPr/>
+      <a:lstStyle/>
+      <a:style>
+        <a:lnRef idx="1">
+          <a:schemeClr val="accent1"/>
+        </a:lnRef>
+        <a:fillRef idx="3">
+          <a:schemeClr val="accent1"/>
+        </a:fillRef>
+        <a:effectRef idx="2">
+          <a:schemeClr val="accent1"/>
+        </a:effectRef>
+        <a:fontRef idx="minor">
+          <a:schemeClr val="lt1"/>
+        </a:fontRef>
+      </a:style>
+    </a:spDef>
+    <a:lnDef>
+      <a:spPr/>
+      <a:bodyPr/>
+      <a:lstStyle/>
+      <a:style>
+        <a:lnRef idx="2">
+          <a:schemeClr val="accent1"/>
+        </a:lnRef>
+        <a:fillRef idx="0">
+          <a:schemeClr val="accent1"/>
+        </a:fillRef>
+        <a:effectRef idx="1">
+          <a:schemeClr val="accent1"/>
+        </a:effectRef>
+        <a:fontRef idx="minor">
+          <a:schemeClr val="tx1"/>
+        </a:fontRef>
+      </a:style>
+    </a:lnDef>
+  </a:objectDefaults>
   <a:extraClrSchemeLst/>
-  <a:extLst>
-    <a:ext uri="{05A4C25C-085E-4340-85A3-A5531E510DB2}">
-      <thm15:themeFamily xmlns:thm15="http://schemas.microsoft.com/office/thememl/2012/main" name="Office Theme" id="{2E142A2C-CD16-42D6-873A-C26D2A0506FA}" vid="{1BDDFF52-6CD6-40A5-AB3C-68EB2F1E4D0A}"/>
-    </a:ext>
-  </a:extLst>
 </a:theme>
 </file>
</xml_diff>